<commit_message>
Update cover letter date to July 20, 2026
Co-Authored-By: Claude Sonnet 5 <noreply@anthropic.com>
Claude-Session: https://claude.ai/code/session_01K26fYxyXRKGQsmkSEPgUi6
</commit_message>
<xml_diff>
--- a/cover-letter-java-fullstack.docx
+++ b/cover-letter-java-fullstack.docx
@@ -40,7 +40,7 @@
         <w:spacing w:after="240"/>
         <w:jc w:val="center"/>
       </w:pPr>
-      <w:hyperlink w:history="1" r:id="rIdzzbxq5btofi2xmp1fsuds">
+      <w:hyperlink w:history="1" r:id="rIdyfct-mlzivslbg8p7n2tp">
         <w:r>
           <w:rPr>
             <w:rStyle w:val="Hyperlink"/>
@@ -59,7 +59,7 @@
         </w:rPr>
         <w:t xml:space="preserve">  |  </w:t>
       </w:r>
-      <w:hyperlink w:history="1" r:id="rIdmmvzy36hybjeqe3snns5t">
+      <w:hyperlink w:history="1" r:id="rIdkba4yiy0sue0_rvqkoo9v">
         <w:r>
           <w:rPr>
             <w:rStyle w:val="Hyperlink"/>
@@ -78,7 +78,7 @@
         </w:rPr>
         <w:t xml:space="preserve">  |  </w:t>
       </w:r>
-      <w:hyperlink w:history="1" r:id="rIdh3dqfs0232ywgpkhrzh0q">
+      <w:hyperlink w:history="1" r:id="rIdrrultiwxcyhl_ogwjyygq">
         <w:r>
           <w:rPr>
             <w:rStyle w:val="Hyperlink"/>
@@ -100,7 +100,7 @@
           <w:sz w:val="22"/>
           <w:szCs w:val="22"/>
         </w:rPr>
-        <w:t xml:space="preserve">July 18, 2026</w:t>
+        <w:t xml:space="preserve">July 20, 2026</w:t>
       </w:r>
     </w:p>
     <w:p>

</xml_diff>

<commit_message>
Remove position-count references and closing interview line from cover letter
Co-Authored-By: Claude Sonnet 5 <noreply@anthropic.com>
Claude-Session: https://claude.ai/code/session_01K26fYxyXRKGQsmkSEPgUi6
</commit_message>
<xml_diff>
--- a/cover-letter-java-fullstack.docx
+++ b/cover-letter-java-fullstack.docx
@@ -40,7 +40,7 @@
         <w:spacing w:after="240"/>
         <w:jc w:val="center"/>
       </w:pPr>
-      <w:hyperlink w:history="1" r:id="rIdyfct-mlzivslbg8p7n2tp">
+      <w:hyperlink w:history="1" r:id="rIducbmpzqrka8przsjaffhk">
         <w:r>
           <w:rPr>
             <w:rStyle w:val="Hyperlink"/>
@@ -59,7 +59,7 @@
         </w:rPr>
         <w:t xml:space="preserve">  |  </w:t>
       </w:r>
-      <w:hyperlink w:history="1" r:id="rIdkba4yiy0sue0_rvqkoo9v">
+      <w:hyperlink w:history="1" r:id="rIdmll3kg8g4zqzwdfbp3_nn">
         <w:r>
           <w:rPr>
             <w:rStyle w:val="Hyperlink"/>
@@ -78,7 +78,7 @@
         </w:rPr>
         <w:t xml:space="preserve">  |  </w:t>
       </w:r>
-      <w:hyperlink w:history="1" r:id="rIdrrultiwxcyhl_ogwjyygq">
+      <w:hyperlink w:history="1" r:id="rIds00te9eka329u2pzmoss6">
         <w:r>
           <w:rPr>
             <w:rStyle w:val="Hyperlink"/>
@@ -128,7 +128,7 @@
           <w:sz w:val="22"/>
           <w:szCs w:val="22"/>
         </w:rPr>
-        <w:t xml:space="preserve">Re: Java Full Stack Developer (Java &amp; Angular) — C2C, 10 Open Positions, Hybrid (Okemos / Farmington Hills, Michigan)</w:t>
+        <w:t xml:space="preserve">Re: Java Full Stack Developer (Java &amp; Angular) — C2C, Hybrid (Okemos / Farmington Hills, Michigan)</w:t>
       </w:r>
     </w:p>
     <w:p>
@@ -154,7 +154,7 @@
           <w:sz w:val="22"/>
           <w:szCs w:val="22"/>
         </w:rPr>
-        <w:t xml:space="preserve">I am writing to apply for the Java Full Stack Developer (Java &amp; Angular) openings you currently have posted — the 10 C2C positions based hybrid out of the Okemos and Farmington Hills, Michigan offices. I am based in Ann Arbor, Michigan, so I can comfortably meet the minimum three-days-a-week in-office requirement at either location, and I am fully available for an in-person interview at my own expense.</w:t>
+        <w:t xml:space="preserve">I am writing to apply for the Java Full Stack Developer (Java &amp; Angular) opening you currently have posted, based hybrid out of the Okemos and Farmington Hills, Michigan offices. I am based in Ann Arbor, Michigan, so I can comfortably meet the minimum three-days-a-week in-office requirement at either location, and I am fully available for an in-person interview at my own expense.</w:t>
       </w:r>
     </w:p>
     <w:p>
@@ -310,20 +310,20 @@
           <w:sz w:val="22"/>
           <w:szCs w:val="22"/>
         </w:rPr>
-        <w:t xml:space="preserve">With ten positions open, I believe my combination of enterprise Java experience, full-stack project delivery, and immediate local availability makes me a strong fit for at least one of them. My resume is attached, and my LinkedIn profile is linked above per the posting's requirements.</w:t>
-      </w:r>
-    </w:p>
-    <w:p>
-      <w:pPr>
-        <w:spacing w:after="160" w:line="276"/>
-      </w:pPr>
-      <w:r>
-        <w:rPr>
-          <w:rFonts w:ascii="Calibri" w:cs="Calibri" w:eastAsia="Calibri" w:hAnsi="Calibri"/>
-          <w:sz w:val="22"/>
-          <w:szCs w:val="22"/>
-        </w:rPr>
-        <w:t xml:space="preserve">Thank you for your time and consideration. I would welcome the opportunity to interview in person and can be available on short notice.</w:t>
+        <w:t xml:space="preserve">I believe my combination of enterprise Java experience, full-stack project delivery, and immediate local availability makes me a strong fit for this role. My resume is attached, and my LinkedIn profile is linked above per the posting's requirements.</w:t>
+      </w:r>
+    </w:p>
+    <w:p>
+      <w:pPr>
+        <w:spacing w:after="160" w:line="276"/>
+      </w:pPr>
+      <w:r>
+        <w:rPr>
+          <w:rFonts w:ascii="Calibri" w:cs="Calibri" w:eastAsia="Calibri" w:hAnsi="Calibri"/>
+          <w:sz w:val="22"/>
+          <w:szCs w:val="22"/>
+        </w:rPr>
+        <w:t xml:space="preserve">Thank you for your time and consideration.</w:t>
       </w:r>
     </w:p>
     <w:p>

</xml_diff>

<commit_message>
Tone down Java experience claims in cover letter to match resume
Co-Authored-By: Claude Sonnet 5 <noreply@anthropic.com>
Claude-Session: https://claude.ai/code/session_01K26fYxyXRKGQsmkSEPgUi6
</commit_message>
<xml_diff>
--- a/cover-letter-java-fullstack.docx
+++ b/cover-letter-java-fullstack.docx
@@ -40,7 +40,7 @@
         <w:spacing w:after="240"/>
         <w:jc w:val="center"/>
       </w:pPr>
-      <w:hyperlink w:history="1" r:id="rIducbmpzqrka8przsjaffhk">
+      <w:hyperlink w:history="1" r:id="rIdovtzcfzlst-02qaonrjaw">
         <w:r>
           <w:rPr>
             <w:rStyle w:val="Hyperlink"/>
@@ -59,7 +59,7 @@
         </w:rPr>
         <w:t xml:space="preserve">  |  </w:t>
       </w:r>
-      <w:hyperlink w:history="1" r:id="rIdmll3kg8g4zqzwdfbp3_nn">
+      <w:hyperlink w:history="1" r:id="rIdmcf--rqod6ohpu_0yp_h4">
         <w:r>
           <w:rPr>
             <w:rStyle w:val="Hyperlink"/>
@@ -78,7 +78,7 @@
         </w:rPr>
         <w:t xml:space="preserve">  |  </w:t>
       </w:r>
-      <w:hyperlink w:history="1" r:id="rIds00te9eka329u2pzmoss6">
+      <w:hyperlink w:history="1" r:id="rIdhnigdzhw4p38nvdymxm1c">
         <w:r>
           <w:rPr>
             <w:rStyle w:val="Hyperlink"/>
@@ -185,7 +185,7 @@
           <w:sz w:val="22"/>
           <w:szCs w:val="22"/>
         </w:rPr>
-        <w:t xml:space="preserve"> for over two years across engineering roles in the Global Risk &amp; Compliance and Credit &amp; Fraud Risk departments. My background maps directly onto a Java full-stack role:</w:t>
+        <w:t xml:space="preserve"> for over two years across engineering roles in the Global Risk &amp; Compliance and Credit &amp; Fraud Risk departments. My background offers a strong engineering foundation for this role:</w:t>
       </w:r>
     </w:p>
     <w:p>
@@ -205,15 +205,15 @@
           <w:sz w:val="22"/>
           <w:szCs w:val="22"/>
         </w:rPr>
-        <w:t xml:space="preserve">Java &amp; backend engineering: </w:t>
-      </w:r>
-      <w:r>
-        <w:rPr>
-          <w:rFonts w:ascii="Calibri" w:cs="Calibri" w:eastAsia="Calibri" w:hAnsi="Calibri"/>
-          <w:sz w:val="22"/>
-          <w:szCs w:val="22"/>
-        </w:rPr>
-        <w:t xml:space="preserve">At American Express, I designed object-oriented Java services following secure coding principles and the full SDLC to automate data sourcing across SQL and JSON formats into Hive. I also built and maintained production pipelines processing millions of transactions per 5-minute feed for the Anti-Money-Laundering Transaction Monitoring team — work that demanded reliability, monitoring, and rigorous data integrity.</w:t>
+        <w:t xml:space="preserve">Software engineering fundamentals: </w:t>
+      </w:r>
+      <w:r>
+        <w:rPr>
+          <w:rFonts w:ascii="Calibri" w:cs="Calibri" w:eastAsia="Calibri" w:hAnsi="Calibri"/>
+          <w:sz w:val="22"/>
+          <w:szCs w:val="22"/>
+        </w:rPr>
+        <w:t xml:space="preserve">At American Express, I built object-oriented Java services to automate data sourcing across SQL and JSON formats into Hive, following secure coding principles and the full SDLC. My primary backend work there was in Python and SQL, where I built and maintained production pipelines processing millions of transactions per 5-minute feed for the Anti-Money-Laundering Transaction Monitoring team — work that demanded reliability, monitoring, and rigorous data integrity, and gave me strong fundamentals in object-oriented design that transfer directly to Java development.</w:t>
       </w:r>
     </w:p>
     <w:p>
@@ -241,7 +241,7 @@
           <w:sz w:val="22"/>
           <w:szCs w:val="22"/>
         </w:rPr>
-        <w:t xml:space="preserve">I work regularly in TypeScript and JavaScript alongside Java, and have built and shipped REST APIs, front-end UIs, and end-to-end features. Most recently, I contributed to Wikimedia's open-source Wikispeech extension, delivering 4 production patches spanning schema design, REST APIs, background job processing, and UI workflows, backed by 40+ PHPUnit tests. My TypeScript experience and component-based front-end work translate directly to Angular's structure of typed components, services, and dependency injection.</w:t>
+        <w:t xml:space="preserve">I work regularly in TypeScript and JavaScript, and have built and shipped REST APIs, front-end UIs, and end-to-end features. Most recently, I contributed to Wikimedia's open-source Wikispeech extension, delivering 4 production patches spanning schema design, REST APIs, background job processing, and UI workflows, backed by 40+ PHPUnit tests. My TypeScript and component-based front-end experience translate well to Angular's structure of typed components, services, and dependency injection, and I'm ready to ramp up quickly on the Java/Angular stack specifically.</w:t>
       </w:r>
     </w:p>
     <w:p>
@@ -310,7 +310,7 @@
           <w:sz w:val="22"/>
           <w:szCs w:val="22"/>
         </w:rPr>
-        <w:t xml:space="preserve">I believe my combination of enterprise Java experience, full-stack project delivery, and immediate local availability makes me a strong fit for this role. My resume is attached, and my LinkedIn profile is linked above per the posting's requirements.</w:t>
+        <w:t xml:space="preserve">I believe my strong CS fundamentals, full-stack project delivery, and immediate local availability make me a quick-ramping, strong fit for this role. My resume is attached, and my LinkedIn profile is linked above per the posting's requirements.</w:t>
       </w:r>
     </w:p>
     <w:p>

</xml_diff>